<commit_message>
docs: agregar 5 imágenes PNG de diagramas UML
- diagrama_1_casos_de_uso.png (actores, CU, include)
- diagrama_2_clases_uml.png (4 capas, clases, relaciones)
- diagrama_3_secuencia_crear_log.png (POST /log flujo completo)
- diagrama_4_componentes.png (Clean Architecture)
- diagrama_5_entidad_relacion.png (Chen: rombos, óvalos, rectángulos)
- Actualizado .docx con imágenes embebidas
- Script generate_uml_images.py (matplotlib)
</commit_message>
<xml_diff>
--- a/docs/Diagramas_UML_ms_auditoria.docx
+++ b/docs/Diagramas_UML_ms_auditoria.docx
@@ -565,6 +565,59 @@
     </w:p>
     <w:p>
       <w:pPr>
+        <w:jc w:val="center"/>
+      </w:pPr>
+      <w:r>
+        <w:drawing>
+          <wp:inline xmlns:a="http://schemas.openxmlformats.org/drawingml/2006/main" xmlns:pic="http://schemas.openxmlformats.org/drawingml/2006/picture">
+            <wp:extent cx="8229600" cy="5955812"/>
+            <wp:docPr id="1" name="Picture 1"/>
+            <wp:cNvGraphicFramePr>
+              <a:graphicFrameLocks noChangeAspect="1"/>
+            </wp:cNvGraphicFramePr>
+            <a:graphic>
+              <a:graphicData uri="http://schemas.openxmlformats.org/drawingml/2006/picture">
+                <pic:pic>
+                  <pic:nvPicPr>
+                    <pic:cNvPr id="0" name="diagrama_1_casos_de_uso.png"/>
+                    <pic:cNvPicPr/>
+                  </pic:nvPicPr>
+                  <pic:blipFill>
+                    <a:blip r:embed="rId9"/>
+                    <a:stretch>
+                      <a:fillRect/>
+                    </a:stretch>
+                  </pic:blipFill>
+                  <pic:spPr>
+                    <a:xfrm>
+                      <a:off x="0" y="0"/>
+                      <a:ext cx="8229600" cy="5955812"/>
+                    </a:xfrm>
+                    <a:prstGeom prst="rect"/>
+                  </pic:spPr>
+                </pic:pic>
+              </a:graphicData>
+            </a:graphic>
+          </wp:inline>
+        </w:drawing>
+      </w:r>
+    </w:p>
+    <w:p>
+      <w:pPr>
+        <w:jc w:val="center"/>
+      </w:pPr>
+      <w:r>
+        <w:rPr>
+          <w:i/>
+          <w:color w:val="666666"/>
+          <w:sz w:val="16"/>
+        </w:rPr>
+        <w:t>Figura: Diagrama 1 Casos De Uso</w:t>
+      </w:r>
+    </w:p>
+    <w:p/>
+    <w:p>
+      <w:pPr>
         <w:spacing w:before="120" w:after="120"/>
       </w:pPr>
       <w:r>
@@ -1730,6 +1783,59 @@
     </w:p>
     <w:p>
       <w:pPr>
+        <w:jc w:val="center"/>
+      </w:pPr>
+      <w:r>
+        <w:drawing>
+          <wp:inline xmlns:a="http://schemas.openxmlformats.org/drawingml/2006/main" xmlns:pic="http://schemas.openxmlformats.org/drawingml/2006/picture">
+            <wp:extent cx="8686800" cy="6114171"/>
+            <wp:docPr id="2" name="Picture 2"/>
+            <wp:cNvGraphicFramePr>
+              <a:graphicFrameLocks noChangeAspect="1"/>
+            </wp:cNvGraphicFramePr>
+            <a:graphic>
+              <a:graphicData uri="http://schemas.openxmlformats.org/drawingml/2006/picture">
+                <pic:pic>
+                  <pic:nvPicPr>
+                    <pic:cNvPr id="0" name="diagrama_2_clases_uml.png"/>
+                    <pic:cNvPicPr/>
+                  </pic:nvPicPr>
+                  <pic:blipFill>
+                    <a:blip r:embed="rId10"/>
+                    <a:stretch>
+                      <a:fillRect/>
+                    </a:stretch>
+                  </pic:blipFill>
+                  <pic:spPr>
+                    <a:xfrm>
+                      <a:off x="0" y="0"/>
+                      <a:ext cx="8686800" cy="6114171"/>
+                    </a:xfrm>
+                    <a:prstGeom prst="rect"/>
+                  </pic:spPr>
+                </pic:pic>
+              </a:graphicData>
+            </a:graphic>
+          </wp:inline>
+        </w:drawing>
+      </w:r>
+    </w:p>
+    <w:p>
+      <w:pPr>
+        <w:jc w:val="center"/>
+      </w:pPr>
+      <w:r>
+        <w:rPr>
+          <w:i/>
+          <w:color w:val="666666"/>
+          <w:sz w:val="16"/>
+        </w:rPr>
+        <w:t>Figura: Diagrama 2 Clases Uml</w:t>
+      </w:r>
+    </w:p>
+    <w:p/>
+    <w:p>
+      <w:pPr>
         <w:spacing w:before="120" w:after="120"/>
       </w:pPr>
       <w:r>
@@ -2889,6 +2995,59 @@
     </w:p>
     <w:p>
       <w:pPr>
+        <w:jc w:val="center"/>
+      </w:pPr>
+      <w:r>
+        <w:drawing>
+          <wp:inline xmlns:a="http://schemas.openxmlformats.org/drawingml/2006/main" xmlns:pic="http://schemas.openxmlformats.org/drawingml/2006/picture">
+            <wp:extent cx="8686800" cy="6544761"/>
+            <wp:docPr id="3" name="Picture 3"/>
+            <wp:cNvGraphicFramePr>
+              <a:graphicFrameLocks noChangeAspect="1"/>
+            </wp:cNvGraphicFramePr>
+            <a:graphic>
+              <a:graphicData uri="http://schemas.openxmlformats.org/drawingml/2006/picture">
+                <pic:pic>
+                  <pic:nvPicPr>
+                    <pic:cNvPr id="0" name="diagrama_3_secuencia_crear_log.png"/>
+                    <pic:cNvPicPr/>
+                  </pic:nvPicPr>
+                  <pic:blipFill>
+                    <a:blip r:embed="rId11"/>
+                    <a:stretch>
+                      <a:fillRect/>
+                    </a:stretch>
+                  </pic:blipFill>
+                  <pic:spPr>
+                    <a:xfrm>
+                      <a:off x="0" y="0"/>
+                      <a:ext cx="8686800" cy="6544761"/>
+                    </a:xfrm>
+                    <a:prstGeom prst="rect"/>
+                  </pic:spPr>
+                </pic:pic>
+              </a:graphicData>
+            </a:graphic>
+          </wp:inline>
+        </w:drawing>
+      </w:r>
+    </w:p>
+    <w:p>
+      <w:pPr>
+        <w:jc w:val="center"/>
+      </w:pPr>
+      <w:r>
+        <w:rPr>
+          <w:i/>
+          <w:color w:val="666666"/>
+          <w:sz w:val="16"/>
+        </w:rPr>
+        <w:t>Figura: Diagrama 3 Secuencia Crear Log</w:t>
+      </w:r>
+    </w:p>
+    <w:p/>
+    <w:p>
+      <w:pPr>
         <w:spacing w:before="120" w:after="120"/>
       </w:pPr>
       <w:r>
@@ -3463,6 +3622,59 @@
     </w:p>
     <w:p>
       <w:pPr>
+        <w:jc w:val="center"/>
+      </w:pPr>
+      <w:r>
+        <w:drawing>
+          <wp:inline xmlns:a="http://schemas.openxmlformats.org/drawingml/2006/main" xmlns:pic="http://schemas.openxmlformats.org/drawingml/2006/picture">
+            <wp:extent cx="8229600" cy="7745090"/>
+            <wp:docPr id="4" name="Picture 4"/>
+            <wp:cNvGraphicFramePr>
+              <a:graphicFrameLocks noChangeAspect="1"/>
+            </wp:cNvGraphicFramePr>
+            <a:graphic>
+              <a:graphicData uri="http://schemas.openxmlformats.org/drawingml/2006/picture">
+                <pic:pic>
+                  <pic:nvPicPr>
+                    <pic:cNvPr id="0" name="diagrama_4_componentes.png"/>
+                    <pic:cNvPicPr/>
+                  </pic:nvPicPr>
+                  <pic:blipFill>
+                    <a:blip r:embed="rId12"/>
+                    <a:stretch>
+                      <a:fillRect/>
+                    </a:stretch>
+                  </pic:blipFill>
+                  <pic:spPr>
+                    <a:xfrm>
+                      <a:off x="0" y="0"/>
+                      <a:ext cx="8229600" cy="7745090"/>
+                    </a:xfrm>
+                    <a:prstGeom prst="rect"/>
+                  </pic:spPr>
+                </pic:pic>
+              </a:graphicData>
+            </a:graphic>
+          </wp:inline>
+        </w:drawing>
+      </w:r>
+    </w:p>
+    <w:p>
+      <w:pPr>
+        <w:jc w:val="center"/>
+      </w:pPr>
+      <w:r>
+        <w:rPr>
+          <w:i/>
+          <w:color w:val="666666"/>
+          <w:sz w:val="16"/>
+        </w:rPr>
+        <w:t>Figura: Diagrama 4 Componentes</w:t>
+      </w:r>
+    </w:p>
+    <w:p/>
+    <w:p>
+      <w:pPr>
         <w:spacing w:before="120" w:after="120"/>
       </w:pPr>
       <w:r>
@@ -3722,6 +3934,59 @@
         <w:t>5.1 Diagrama ER Completo</w:t>
       </w:r>
     </w:p>
+    <w:p>
+      <w:pPr>
+        <w:jc w:val="center"/>
+      </w:pPr>
+      <w:r>
+        <w:drawing>
+          <wp:inline xmlns:a="http://schemas.openxmlformats.org/drawingml/2006/main" xmlns:pic="http://schemas.openxmlformats.org/drawingml/2006/picture">
+            <wp:extent cx="8686800" cy="5762613"/>
+            <wp:docPr id="5" name="Picture 5"/>
+            <wp:cNvGraphicFramePr>
+              <a:graphicFrameLocks noChangeAspect="1"/>
+            </wp:cNvGraphicFramePr>
+            <a:graphic>
+              <a:graphicData uri="http://schemas.openxmlformats.org/drawingml/2006/picture">
+                <pic:pic>
+                  <pic:nvPicPr>
+                    <pic:cNvPr id="0" name="diagrama_5_entidad_relacion.png"/>
+                    <pic:cNvPicPr/>
+                  </pic:nvPicPr>
+                  <pic:blipFill>
+                    <a:blip r:embed="rId13"/>
+                    <a:stretch>
+                      <a:fillRect/>
+                    </a:stretch>
+                  </pic:blipFill>
+                  <pic:spPr>
+                    <a:xfrm>
+                      <a:off x="0" y="0"/>
+                      <a:ext cx="8686800" cy="5762613"/>
+                    </a:xfrm>
+                    <a:prstGeom prst="rect"/>
+                  </pic:spPr>
+                </pic:pic>
+              </a:graphicData>
+            </a:graphic>
+          </wp:inline>
+        </w:drawing>
+      </w:r>
+    </w:p>
+    <w:p>
+      <w:pPr>
+        <w:jc w:val="center"/>
+      </w:pPr>
+      <w:r>
+        <w:rPr>
+          <w:i/>
+          <w:color w:val="666666"/>
+          <w:sz w:val="16"/>
+        </w:rPr>
+        <w:t>Figura: Diagrama 5 Entidad Relacion</w:t>
+      </w:r>
+    </w:p>
+    <w:p/>
     <w:p>
       <w:pPr>
         <w:spacing w:before="120" w:after="120"/>

</xml_diff>